<commit_message>
Transakcyjne tworzenie lekarza, widok mobilny, finalne dokumenty
- konto i profil lekarza powstaja w jednej transakcji (rollback przy bledzie)
- breakpoint mobilny: sidebar zwija sie do gornego paska, formularze
  i tabele dostosowane do waskich ekranow (+ zrzut z widoku telefonu)
- raport.docx/pdf ze skladem zespolu (B. Furmanczyk 22218, K. Ciastek 21850)
- osobna instrukcja-uruchomienia.docx/pdf wzorowana na przykladzie
  prowadzacego
</commit_message>
<xml_diff>
--- a/docs/raport.docx
+++ b/docs/raport.docx
@@ -472,7 +472,7 @@
                 <w:sz w:val="20"/>
                 <w:szCs w:val="20"/>
               </w:rPr>
-              <w:t xml:space="preserve"/>
+              <w:t xml:space="preserve">Bartłomiej</w:t>
             </w:r>
           </w:p>
         </w:tc>
@@ -505,7 +505,7 @@
                 <w:sz w:val="20"/>
                 <w:szCs w:val="20"/>
               </w:rPr>
-              <w:t xml:space="preserve"/>
+              <w:t xml:space="preserve">Furmańczyk</w:t>
             </w:r>
           </w:p>
         </w:tc>
@@ -538,7 +538,7 @@
                 <w:sz w:val="20"/>
                 <w:szCs w:val="20"/>
               </w:rPr>
-              <w:t xml:space="preserve"/>
+              <w:t xml:space="preserve">22218</w:t>
             </w:r>
           </w:p>
         </w:tc>
@@ -705,7 +705,7 @@
                 <w:sz w:val="20"/>
                 <w:szCs w:val="20"/>
               </w:rPr>
-              <w:t xml:space="preserve"/>
+              <w:t xml:space="preserve">Kamil</w:t>
             </w:r>
           </w:p>
         </w:tc>
@@ -738,7 +738,7 @@
                 <w:sz w:val="20"/>
                 <w:szCs w:val="20"/>
               </w:rPr>
-              <w:t xml:space="preserve"/>
+              <w:t xml:space="preserve">Ciastek</w:t>
             </w:r>
           </w:p>
         </w:tc>
@@ -771,240 +771,7 @@
                 <w:sz w:val="20"/>
                 <w:szCs w:val="20"/>
               </w:rPr>
-              <w:t xml:space="preserve"/>
-            </w:r>
-          </w:p>
-        </w:tc>
-        <w:tc>
-          <w:tcPr>
-            <w:tcW w:type="dxa" w:w="1500"/>
-            <w:tcBorders>
-              <w:top w:val="single" w:color="000000" w:sz="1"/>
-              <w:left w:val="single" w:color="000000" w:sz="1"/>
-              <w:bottom w:val="single" w:color="000000" w:sz="1"/>
-              <w:right w:val="single" w:color="000000" w:sz="1"/>
-            </w:tcBorders>
-            <w:tcMar>
-              <w:top w:type="dxa" w:w="60"/>
-              <w:left w:type="dxa" w:w="80"/>
-              <w:bottom w:type="dxa" w:w="60"/>
-              <w:right w:type="dxa" w:w="80"/>
-            </w:tcMar>
-            <w:vAlign w:val="center"/>
-          </w:tcPr>
-          <w:p>
-            <w:pPr>
-              <w:jc w:val="center"/>
-            </w:pPr>
-            <w:r>
-              <w:rPr>
-                <w:rFonts w:ascii="Arial" w:cs="Arial" w:eastAsia="Arial" w:hAnsi="Arial"/>
-                <w:i w:val="false"/>
-                <w:iCs w:val="false"/>
-                <w:sz w:val="20"/>
-                <w:szCs w:val="20"/>
-              </w:rPr>
-              <w:t xml:space="preserve">Informatyka</w:t>
-            </w:r>
-          </w:p>
-        </w:tc>
-        <w:tc>
-          <w:tcPr>
-            <w:tcW w:type="dxa" w:w="1500"/>
-            <w:tcBorders>
-              <w:top w:val="single" w:color="000000" w:sz="1"/>
-              <w:left w:val="single" w:color="000000" w:sz="1"/>
-              <w:bottom w:val="single" w:color="000000" w:sz="1"/>
-              <w:right w:val="single" w:color="000000" w:sz="1"/>
-            </w:tcBorders>
-            <w:tcMar>
-              <w:top w:type="dxa" w:w="60"/>
-              <w:left w:type="dxa" w:w="80"/>
-              <w:bottom w:type="dxa" w:w="60"/>
-              <w:right w:type="dxa" w:w="80"/>
-            </w:tcMar>
-            <w:vAlign w:val="center"/>
-          </w:tcPr>
-          <w:p>
-            <w:pPr>
-              <w:jc w:val="center"/>
-            </w:pPr>
-            <w:r>
-              <w:rPr>
-                <w:rFonts w:ascii="Arial" w:cs="Arial" w:eastAsia="Arial" w:hAnsi="Arial"/>
-                <w:i w:val="false"/>
-                <w:iCs w:val="false"/>
-                <w:sz w:val="20"/>
-                <w:szCs w:val="20"/>
-              </w:rPr>
-              <w:t xml:space="preserve"/>
-            </w:r>
-          </w:p>
-        </w:tc>
-        <w:tc>
-          <w:tcPr>
-            <w:tcW w:type="dxa" w:w="1100"/>
-            <w:tcBorders>
-              <w:top w:val="single" w:color="000000" w:sz="1"/>
-              <w:left w:val="single" w:color="000000" w:sz="1"/>
-              <w:bottom w:val="single" w:color="000000" w:sz="1"/>
-              <w:right w:val="single" w:color="000000" w:sz="1"/>
-            </w:tcBorders>
-            <w:tcMar>
-              <w:top w:type="dxa" w:w="60"/>
-              <w:left w:type="dxa" w:w="80"/>
-              <w:bottom w:type="dxa" w:w="60"/>
-              <w:right w:type="dxa" w:w="80"/>
-            </w:tcMar>
-            <w:vAlign w:val="center"/>
-          </w:tcPr>
-          <w:p>
-            <w:pPr>
-              <w:jc w:val="center"/>
-            </w:pPr>
-            <w:r>
-              <w:rPr>
-                <w:rFonts w:ascii="Arial" w:cs="Arial" w:eastAsia="Arial" w:hAnsi="Arial"/>
-                <w:i w:val="false"/>
-                <w:iCs w:val="false"/>
-                <w:sz w:val="20"/>
-                <w:szCs w:val="20"/>
-              </w:rPr>
-              <w:t xml:space="preserve">VI</w:t>
-            </w:r>
-          </w:p>
-        </w:tc>
-        <w:tc>
-          <w:tcPr>
-            <w:tcW w:type="dxa" w:w="1126"/>
-            <w:tcBorders>
-              <w:top w:val="single" w:color="000000" w:sz="1"/>
-              <w:left w:val="single" w:color="000000" w:sz="1"/>
-              <w:bottom w:val="single" w:color="000000" w:sz="1"/>
-              <w:right w:val="single" w:color="000000" w:sz="1"/>
-            </w:tcBorders>
-            <w:tcMar>
-              <w:top w:type="dxa" w:w="60"/>
-              <w:left w:type="dxa" w:w="80"/>
-              <w:bottom w:type="dxa" w:w="60"/>
-              <w:right w:type="dxa" w:w="80"/>
-            </w:tcMar>
-            <w:vAlign w:val="center"/>
-          </w:tcPr>
-          <w:p>
-            <w:pPr>
-              <w:jc w:val="center"/>
-            </w:pPr>
-            <w:r>
-              <w:rPr>
-                <w:rFonts w:ascii="Arial" w:cs="Arial" w:eastAsia="Arial" w:hAnsi="Arial"/>
-                <w:i w:val="false"/>
-                <w:iCs w:val="false"/>
-                <w:sz w:val="20"/>
-                <w:szCs w:val="20"/>
-              </w:rPr>
-              <w:t xml:space="preserve">2025/2026</w:t>
-            </w:r>
-          </w:p>
-        </w:tc>
-      </w:tr>
-      <w:tr>
-        <w:tc>
-          <w:tcPr>
-            <w:tcW w:type="dxa" w:w="1100"/>
-            <w:tcBorders>
-              <w:top w:val="single" w:color="000000" w:sz="1"/>
-              <w:left w:val="single" w:color="000000" w:sz="1"/>
-              <w:bottom w:val="single" w:color="000000" w:sz="1"/>
-              <w:right w:val="single" w:color="000000" w:sz="1"/>
-            </w:tcBorders>
-            <w:tcMar>
-              <w:top w:type="dxa" w:w="60"/>
-              <w:left w:type="dxa" w:w="80"/>
-              <w:bottom w:type="dxa" w:w="60"/>
-              <w:right w:type="dxa" w:w="80"/>
-            </w:tcMar>
-            <w:vAlign w:val="center"/>
-          </w:tcPr>
-          <w:p>
-            <w:pPr>
-              <w:jc w:val="center"/>
-            </w:pPr>
-            <w:r>
-              <w:rPr>
-                <w:rFonts w:ascii="Arial" w:cs="Arial" w:eastAsia="Arial" w:hAnsi="Arial"/>
-                <w:i w:val="false"/>
-                <w:iCs w:val="false"/>
-                <w:sz w:val="20"/>
-                <w:szCs w:val="20"/>
-              </w:rPr>
-              <w:t xml:space="preserve"/>
-            </w:r>
-          </w:p>
-        </w:tc>
-        <w:tc>
-          <w:tcPr>
-            <w:tcW w:type="dxa" w:w="1500"/>
-            <w:tcBorders>
-              <w:top w:val="single" w:color="000000" w:sz="1"/>
-              <w:left w:val="single" w:color="000000" w:sz="1"/>
-              <w:bottom w:val="single" w:color="000000" w:sz="1"/>
-              <w:right w:val="single" w:color="000000" w:sz="1"/>
-            </w:tcBorders>
-            <w:tcMar>
-              <w:top w:type="dxa" w:w="60"/>
-              <w:left w:type="dxa" w:w="80"/>
-              <w:bottom w:type="dxa" w:w="60"/>
-              <w:right w:type="dxa" w:w="80"/>
-            </w:tcMar>
-            <w:vAlign w:val="center"/>
-          </w:tcPr>
-          <w:p>
-            <w:pPr>
-              <w:jc w:val="center"/>
-            </w:pPr>
-            <w:r>
-              <w:rPr>
-                <w:rFonts w:ascii="Arial" w:cs="Arial" w:eastAsia="Arial" w:hAnsi="Arial"/>
-                <w:i w:val="false"/>
-                <w:iCs w:val="false"/>
-                <w:sz w:val="20"/>
-                <w:szCs w:val="20"/>
-              </w:rPr>
-              <w:t xml:space="preserve"/>
-            </w:r>
-          </w:p>
-        </w:tc>
-        <w:tc>
-          <w:tcPr>
-            <w:tcW w:type="dxa" w:w="1200"/>
-            <w:tcBorders>
-              <w:top w:val="single" w:color="000000" w:sz="1"/>
-              <w:left w:val="single" w:color="000000" w:sz="1"/>
-              <w:bottom w:val="single" w:color="000000" w:sz="1"/>
-              <w:right w:val="single" w:color="000000" w:sz="1"/>
-            </w:tcBorders>
-            <w:tcMar>
-              <w:top w:type="dxa" w:w="60"/>
-              <w:left w:type="dxa" w:w="80"/>
-              <w:bottom w:type="dxa" w:w="60"/>
-              <w:right w:type="dxa" w:w="80"/>
-            </w:tcMar>
-            <w:vAlign w:val="center"/>
-          </w:tcPr>
-          <w:p>
-            <w:pPr>
-              <w:jc w:val="center"/>
-            </w:pPr>
-            <w:r>
-              <w:rPr>
-                <w:rFonts w:ascii="Arial" w:cs="Arial" w:eastAsia="Arial" w:hAnsi="Arial"/>
-                <w:i w:val="false"/>
-                <w:iCs w:val="false"/>
-                <w:sz w:val="20"/>
-                <w:szCs w:val="20"/>
-              </w:rPr>
-              <w:t xml:space="preserve"/>
+              <w:t xml:space="preserve">21850</w:t>
             </w:r>
           </w:p>
         </w:tc>
@@ -2731,6 +2498,77 @@
           <w:szCs w:val="20"/>
         </w:rPr>
         <w:t xml:space="preserve">Rys. 13. Przegląd wszystkich wizyt w systemie z filtrem po statusie.</w:t>
+      </w:r>
+    </w:p>
+    <w:p>
+      <w:pPr>
+        <w:pStyle w:val="Heading2"/>
+      </w:pPr>
+      <w:r>
+        <w:t xml:space="preserve">6.5. Wersja mobilna</w:t>
+      </w:r>
+    </w:p>
+    <w:p>
+      <w:pPr>
+        <w:spacing w:after="60" w:before="120"/>
+        <w:jc w:val="center"/>
+      </w:pPr>
+      <w:r>
+        <w:drawing>
+          <wp:inline distT="0" distB="0" distL="0" distR="0">
+            <wp:extent cx="2667000" cy="5772150"/>
+            <wp:effectExtent t="0" r="0" b="0" l="0"/>
+            <wp:docPr id="1" name="14-mobile-umawianie.png" descr="14-mobile-umawianie.png" title="14-mobile-umawianie.png"/>
+            <wp:cNvGraphicFramePr>
+              <a:graphicFrameLocks xmlns:a="http://schemas.openxmlformats.org/drawingml/2006/main" noChangeAspect="1"/>
+            </wp:cNvGraphicFramePr>
+            <a:graphic xmlns:a="http://schemas.openxmlformats.org/drawingml/2006/main">
+              <a:graphicData uri="http://schemas.openxmlformats.org/drawingml/2006/picture">
+                <pic:pic xmlns:pic="http://schemas.openxmlformats.org/drawingml/2006/picture">
+                  <pic:nvPicPr>
+                    <pic:cNvPr id="0" name="" descr=""/>
+                    <pic:cNvPicPr>
+                      <a:picLocks noChangeAspect="1" noChangeArrowheads="1"/>
+                    </pic:cNvPicPr>
+                  </pic:nvPicPr>
+                  <pic:blipFill>
+                    <a:blip r:embed="rId21" cstate="none"/>
+                    <a:srcRect/>
+                    <a:stretch>
+                      <a:fillRect/>
+                    </a:stretch>
+                  </pic:blipFill>
+                  <pic:spPr bwMode="auto">
+                    <a:xfrm>
+                      <a:off x="0" y="0"/>
+                      <a:ext cx="2667000" cy="5772150"/>
+                    </a:xfrm>
+                    <a:prstGeom prst="rect">
+                      <a:avLst/>
+                    </a:prstGeom>
+                  </pic:spPr>
+                </pic:pic>
+              </a:graphicData>
+            </a:graphic>
+          </wp:inline>
+        </w:drawing>
+      </w:r>
+    </w:p>
+    <w:p>
+      <w:pPr>
+        <w:spacing w:after="240"/>
+        <w:jc w:val="center"/>
+      </w:pPr>
+      <w:r>
+        <w:rPr>
+          <w:rFonts w:ascii="Arial" w:cs="Arial" w:eastAsia="Arial" w:hAnsi="Arial"/>
+          <w:i/>
+          <w:iCs/>
+          <w:color w:val="444444"/>
+          <w:sz w:val="20"/>
+          <w:szCs w:val="20"/>
+        </w:rPr>
+        <w:t xml:space="preserve">Rys. 14. Responsywny interfejs – umawianie wizyty na ekranie telefonu (menu zwinięte do górnego paska).</w:t>
       </w:r>
     </w:p>
     <w:p>

</xml_diff>

<commit_message>
Raport: logo WSPA na stronie tytulowej, specjalnosc Technologie Webowe
</commit_message>
<xml_diff>
--- a/docs/raport.docx
+++ b/docs/raport.docx
@@ -2,6 +2,52 @@
 <file path=word/document.xml><?xml version="1.0" encoding="utf-8"?>
 <w:document xmlns:wpc="http://schemas.microsoft.com/office/word/2010/wordprocessingCanvas" xmlns:mc="http://schemas.openxmlformats.org/markup-compatibility/2006" xmlns:o="urn:schemas-microsoft-com:office:office" xmlns:r="http://schemas.openxmlformats.org/officeDocument/2006/relationships" xmlns:m="http://schemas.openxmlformats.org/officeDocument/2006/math" xmlns:v="urn:schemas-microsoft-com:vml" xmlns:wp14="http://schemas.microsoft.com/office/word/2010/wordprocessingDrawing" xmlns:wp="http://schemas.openxmlformats.org/drawingml/2006/wordprocessingDrawing" xmlns:w10="urn:schemas-microsoft-com:office:word" xmlns:w="http://schemas.openxmlformats.org/wordprocessingml/2006/main" xmlns:w14="http://schemas.microsoft.com/office/word/2010/wordml" xmlns:w15="http://schemas.microsoft.com/office/word/2012/wordml" xmlns:wpg="http://schemas.microsoft.com/office/word/2010/wordprocessingGroup" xmlns:wpi="http://schemas.microsoft.com/office/word/2010/wordprocessingInk" xmlns:wne="http://schemas.microsoft.com/office/word/2006/wordml" xmlns:wps="http://schemas.microsoft.com/office/word/2010/wordprocessingShape" xmlns:cx="http://schemas.microsoft.com/office/drawing/2014/chartex" xmlns:cx1="http://schemas.microsoft.com/office/drawing/2015/9/8/chartex" xmlns:cx2="http://schemas.microsoft.com/office/drawing/2015/10/21/chartex" xmlns:cx3="http://schemas.microsoft.com/office/drawing/2016/5/9/chartex" xmlns:cx4="http://schemas.microsoft.com/office/drawing/2016/5/10/chartex" xmlns:cx5="http://schemas.microsoft.com/office/drawing/2016/5/11/chartex" xmlns:cx6="http://schemas.microsoft.com/office/drawing/2016/5/12/chartex" xmlns:cx7="http://schemas.microsoft.com/office/drawing/2016/5/13/chartex" xmlns:cx8="http://schemas.microsoft.com/office/drawing/2016/5/14/chartex" xmlns:aink="http://schemas.microsoft.com/office/drawing/2016/ink" xmlns:am3d="http://schemas.microsoft.com/office/drawing/2017/model3d" xmlns:w16cex="http://schemas.microsoft.com/office/word/2018/wordml/cex" xmlns:w16cid="http://schemas.microsoft.com/office/word/2016/wordml/cid" xmlns:w16="http://schemas.microsoft.com/office/word/2018/wordml" xmlns:w16sdtdh="http://schemas.microsoft.com/office/word/2020/wordml/sdtdatahash" xmlns:w16se="http://schemas.microsoft.com/office/word/2015/wordml/symex" mc:Ignorable="w14 w15 wp14">
   <w:body>
+    <w:p>
+      <w:pPr>
+        <w:spacing w:after="240"/>
+        <w:jc w:val="center"/>
+      </w:pPr>
+      <w:r>
+        <w:drawing>
+          <wp:inline distT="0" distB="0" distL="0" distR="0">
+            <wp:extent cx="2381250" cy="885825"/>
+            <wp:effectExtent t="0" r="0" b="0" l="0"/>
+            <wp:docPr id="1" name="wspa" descr="Logo Wyzszej Szkoly Przedsiebiorczosci i Administracji" title="Logo WSPA"/>
+            <wp:cNvGraphicFramePr>
+              <a:graphicFrameLocks xmlns:a="http://schemas.openxmlformats.org/drawingml/2006/main" noChangeAspect="1"/>
+            </wp:cNvGraphicFramePr>
+            <a:graphic xmlns:a="http://schemas.openxmlformats.org/drawingml/2006/main">
+              <a:graphicData uri="http://schemas.openxmlformats.org/drawingml/2006/picture">
+                <pic:pic xmlns:pic="http://schemas.openxmlformats.org/drawingml/2006/picture">
+                  <pic:nvPicPr>
+                    <pic:cNvPr id="0" name="" descr=""/>
+                    <pic:cNvPicPr>
+                      <a:picLocks noChangeAspect="1" noChangeArrowheads="1"/>
+                    </pic:cNvPicPr>
+                  </pic:nvPicPr>
+                  <pic:blipFill>
+                    <a:blip r:embed="rId7" cstate="none"/>
+                    <a:srcRect/>
+                    <a:stretch>
+                      <a:fillRect/>
+                    </a:stretch>
+                  </pic:blipFill>
+                  <pic:spPr bwMode="auto">
+                    <a:xfrm>
+                      <a:off x="0" y="0"/>
+                      <a:ext cx="2381250" cy="885825"/>
+                    </a:xfrm>
+                    <a:prstGeom prst="rect">
+                      <a:avLst/>
+                    </a:prstGeom>
+                  </pic:spPr>
+                </pic:pic>
+              </a:graphicData>
+            </a:graphic>
+          </wp:inline>
+        </w:drawing>
+      </w:r>
+    </w:p>
     <w:p>
       <w:pPr>
         <w:spacing w:after="360" w:before="0"/>
@@ -102,7 +148,7 @@
                     </pic:cNvPicPr>
                   </pic:nvPicPr>
                   <pic:blipFill>
-                    <a:blip r:embed="rId7" cstate="none"/>
+                    <a:blip r:embed="rId8" cstate="none"/>
                     <a:srcRect/>
                     <a:stretch>
                       <a:fillRect/>
@@ -604,7 +650,7 @@
                 <w:sz w:val="20"/>
                 <w:szCs w:val="20"/>
               </w:rPr>
-              <w:t xml:space="preserve"/>
+              <w:t xml:space="preserve">Technologie Webowe</w:t>
             </w:r>
           </w:p>
         </w:tc>
@@ -837,7 +883,7 @@
                 <w:sz w:val="20"/>
                 <w:szCs w:val="20"/>
               </w:rPr>
-              <w:t xml:space="preserve"/>
+              <w:t xml:space="preserve">Technologie Webowe</w:t>
             </w:r>
           </w:p>
         </w:tc>
@@ -1681,69 +1727,6 @@
                     </pic:cNvPicPr>
                   </pic:nvPicPr>
                   <pic:blipFill>
-                    <a:blip r:embed="rId8" cstate="none"/>
-                    <a:srcRect/>
-                    <a:stretch>
-                      <a:fillRect/>
-                    </a:stretch>
-                  </pic:blipFill>
-                  <pic:spPr bwMode="auto">
-                    <a:xfrm>
-                      <a:off x="0" y="0"/>
-                      <a:ext cx="5619750" cy="3514725"/>
-                    </a:xfrm>
-                    <a:prstGeom prst="rect">
-                      <a:avLst/>
-                    </a:prstGeom>
-                  </pic:spPr>
-                </pic:pic>
-              </a:graphicData>
-            </a:graphic>
-          </wp:inline>
-        </w:drawing>
-      </w:r>
-    </w:p>
-    <w:p>
-      <w:pPr>
-        <w:spacing w:after="240"/>
-        <w:jc w:val="center"/>
-      </w:pPr>
-      <w:r>
-        <w:rPr>
-          <w:rFonts w:ascii="Arial" w:cs="Arial" w:eastAsia="Arial" w:hAnsi="Arial"/>
-          <w:i/>
-          <w:iCs/>
-          <w:color w:val="444444"/>
-          <w:sz w:val="20"/>
-          <w:szCs w:val="20"/>
-        </w:rPr>
-        <w:t xml:space="preserve">Rys. 1. Ekran logowania – walidacja danych, odnośnik do rejestracji oraz lista kont demonstracyjnych.</w:t>
-      </w:r>
-    </w:p>
-    <w:p>
-      <w:pPr>
-        <w:spacing w:after="60" w:before="120"/>
-        <w:jc w:val="center"/>
-      </w:pPr>
-      <w:r>
-        <w:drawing>
-          <wp:inline distT="0" distB="0" distL="0" distR="0">
-            <wp:extent cx="5619750" cy="3514725"/>
-            <wp:effectExtent t="0" r="0" b="0" l="0"/>
-            <wp:docPr id="1" name="02-rejestracja.png" descr="02-rejestracja.png" title="02-rejestracja.png"/>
-            <wp:cNvGraphicFramePr>
-              <a:graphicFrameLocks xmlns:a="http://schemas.openxmlformats.org/drawingml/2006/main" noChangeAspect="1"/>
-            </wp:cNvGraphicFramePr>
-            <a:graphic xmlns:a="http://schemas.openxmlformats.org/drawingml/2006/main">
-              <a:graphicData uri="http://schemas.openxmlformats.org/drawingml/2006/picture">
-                <pic:pic xmlns:pic="http://schemas.openxmlformats.org/drawingml/2006/picture">
-                  <pic:nvPicPr>
-                    <pic:cNvPr id="0" name="" descr=""/>
-                    <pic:cNvPicPr>
-                      <a:picLocks noChangeAspect="1" noChangeArrowheads="1"/>
-                    </pic:cNvPicPr>
-                  </pic:nvPicPr>
-                  <pic:blipFill>
                     <a:blip r:embed="rId9" cstate="none"/>
                     <a:srcRect/>
                     <a:stretch>
@@ -1780,15 +1763,7 @@
           <w:sz w:val="20"/>
           <w:szCs w:val="20"/>
         </w:rPr>
-        <w:t xml:space="preserve">Rys. 2. Rejestracja pacjenta – formularz z walidacją adresu e-mail, telefonu i siły hasła.</w:t>
-      </w:r>
-    </w:p>
-    <w:p>
-      <w:pPr>
-        <w:pStyle w:val="Heading2"/>
-      </w:pPr>
-      <w:r>
-        <w:t xml:space="preserve">6.2. Panel pacjenta</w:t>
+        <w:t xml:space="preserve">Rys. 1. Ekran logowania – walidacja danych, odnośnik do rejestracji oraz lista kont demonstracyjnych.</w:t>
       </w:r>
     </w:p>
     <w:p>
@@ -1801,7 +1776,7 @@
           <wp:inline distT="0" distB="0" distL="0" distR="0">
             <wp:extent cx="5619750" cy="3514725"/>
             <wp:effectExtent t="0" r="0" b="0" l="0"/>
-            <wp:docPr id="1" name="03-umawianie-wizyty.png" descr="03-umawianie-wizyty.png" title="03-umawianie-wizyty.png"/>
+            <wp:docPr id="1" name="02-rejestracja.png" descr="02-rejestracja.png" title="02-rejestracja.png"/>
             <wp:cNvGraphicFramePr>
               <a:graphicFrameLocks xmlns:a="http://schemas.openxmlformats.org/drawingml/2006/main" noChangeAspect="1"/>
             </wp:cNvGraphicFramePr>
@@ -1851,7 +1826,15 @@
           <w:sz w:val="20"/>
           <w:szCs w:val="20"/>
         </w:rPr>
-        <w:t xml:space="preserve">Rys. 3. Umawianie wizyty – po wyborze specjalizacji, lekarza i daty system pokazuje wyłącznie wolne godziny (zajęte terminy 09:00 i 10:30 nie są dostępne).</w:t>
+        <w:t xml:space="preserve">Rys. 2. Rejestracja pacjenta – formularz z walidacją adresu e-mail, telefonu i siły hasła.</w:t>
+      </w:r>
+    </w:p>
+    <w:p>
+      <w:pPr>
+        <w:pStyle w:val="Heading2"/>
+      </w:pPr>
+      <w:r>
+        <w:t xml:space="preserve">6.2. Panel pacjenta</w:t>
       </w:r>
     </w:p>
     <w:p>
@@ -1864,7 +1847,7 @@
           <wp:inline distT="0" distB="0" distL="0" distR="0">
             <wp:extent cx="5619750" cy="3514725"/>
             <wp:effectExtent t="0" r="0" b="0" l="0"/>
-            <wp:docPr id="1" name="04-moje-wizyty.png" descr="04-moje-wizyty.png" title="04-moje-wizyty.png"/>
+            <wp:docPr id="1" name="03-umawianie-wizyty.png" descr="03-umawianie-wizyty.png" title="03-umawianie-wizyty.png"/>
             <wp:cNvGraphicFramePr>
               <a:graphicFrameLocks xmlns:a="http://schemas.openxmlformats.org/drawingml/2006/main" noChangeAspect="1"/>
             </wp:cNvGraphicFramePr>
@@ -1914,7 +1897,7 @@
           <w:sz w:val="20"/>
           <w:szCs w:val="20"/>
         </w:rPr>
-        <w:t xml:space="preserve">Rys. 4. Moje wizyty – lista wizyt pacjenta ze statusami, zaleceniami lekarza i możliwością anulowania nadchodzącej wizyty.</w:t>
+        <w:t xml:space="preserve">Rys. 3. Umawianie wizyty – po wyborze specjalizacji, lekarza i daty system pokazuje wyłącznie wolne godziny (zajęte terminy 09:00 i 10:30 nie są dostępne).</w:t>
       </w:r>
     </w:p>
     <w:p>
@@ -1927,7 +1910,7 @@
           <wp:inline distT="0" distB="0" distL="0" distR="0">
             <wp:extent cx="5619750" cy="3514725"/>
             <wp:effectExtent t="0" r="0" b="0" l="0"/>
-            <wp:docPr id="1" name="05-profil.png" descr="05-profil.png" title="05-profil.png"/>
+            <wp:docPr id="1" name="04-moje-wizyty.png" descr="04-moje-wizyty.png" title="04-moje-wizyty.png"/>
             <wp:cNvGraphicFramePr>
               <a:graphicFrameLocks xmlns:a="http://schemas.openxmlformats.org/drawingml/2006/main" noChangeAspect="1"/>
             </wp:cNvGraphicFramePr>
@@ -1977,15 +1960,7 @@
           <w:sz w:val="20"/>
           <w:szCs w:val="20"/>
         </w:rPr>
-        <w:t xml:space="preserve">Rys. 5. Profil użytkownika – edycja danych osobowych oraz zmiana hasła (z weryfikacją obecnego hasła).</w:t>
-      </w:r>
-    </w:p>
-    <w:p>
-      <w:pPr>
-        <w:pStyle w:val="Heading2"/>
-      </w:pPr>
-      <w:r>
-        <w:t xml:space="preserve">6.3. Panel lekarza</w:t>
+        <w:t xml:space="preserve">Rys. 4. Moje wizyty – lista wizyt pacjenta ze statusami, zaleceniami lekarza i możliwością anulowania nadchodzącej wizyty.</w:t>
       </w:r>
     </w:p>
     <w:p>
@@ -1998,7 +1973,7 @@
           <wp:inline distT="0" distB="0" distL="0" distR="0">
             <wp:extent cx="5619750" cy="3514725"/>
             <wp:effectExtent t="0" r="0" b="0" l="0"/>
-            <wp:docPr id="1" name="06-grafik-dnia.png" descr="06-grafik-dnia.png" title="06-grafik-dnia.png"/>
+            <wp:docPr id="1" name="05-profil.png" descr="05-profil.png" title="05-profil.png"/>
             <wp:cNvGraphicFramePr>
               <a:graphicFrameLocks xmlns:a="http://schemas.openxmlformats.org/drawingml/2006/main" noChangeAspect="1"/>
             </wp:cNvGraphicFramePr>
@@ -2048,7 +2023,15 @@
           <w:sz w:val="20"/>
           <w:szCs w:val="20"/>
         </w:rPr>
-        <w:t xml:space="preserve">Rys. 6. Grafik dnia – wizyty lekarza w wybranym dniu; lekarz oznacza wizytę jako odbytą i zapisuje zalecenia dla pacjenta.</w:t>
+        <w:t xml:space="preserve">Rys. 5. Profil użytkownika – edycja danych osobowych oraz zmiana hasła (z weryfikacją obecnego hasła).</w:t>
+      </w:r>
+    </w:p>
+    <w:p>
+      <w:pPr>
+        <w:pStyle w:val="Heading2"/>
+      </w:pPr>
+      <w:r>
+        <w:t xml:space="preserve">6.3. Panel lekarza</w:t>
       </w:r>
     </w:p>
     <w:p>
@@ -2061,7 +2044,7 @@
           <wp:inline distT="0" distB="0" distL="0" distR="0">
             <wp:extent cx="5619750" cy="3514725"/>
             <wp:effectExtent t="0" r="0" b="0" l="0"/>
-            <wp:docPr id="1" name="07-wizyty-lekarza.png" descr="07-wizyty-lekarza.png" title="07-wizyty-lekarza.png"/>
+            <wp:docPr id="1" name="06-grafik-dnia.png" descr="06-grafik-dnia.png" title="06-grafik-dnia.png"/>
             <wp:cNvGraphicFramePr>
               <a:graphicFrameLocks xmlns:a="http://schemas.openxmlformats.org/drawingml/2006/main" noChangeAspect="1"/>
             </wp:cNvGraphicFramePr>
@@ -2111,15 +2094,7 @@
           <w:sz w:val="20"/>
           <w:szCs w:val="20"/>
         </w:rPr>
-        <w:t xml:space="preserve">Rys. 7. Historia wszystkich wizyt lekarza wraz ze statusami i zapisanymi zaleceniami.</w:t>
-      </w:r>
-    </w:p>
-    <w:p>
-      <w:pPr>
-        <w:pStyle w:val="Heading2"/>
-      </w:pPr>
-      <w:r>
-        <w:t xml:space="preserve">6.4. Panel administratora</w:t>
+        <w:t xml:space="preserve">Rys. 6. Grafik dnia – wizyty lekarza w wybranym dniu; lekarz oznacza wizytę jako odbytą i zapisuje zalecenia dla pacjenta.</w:t>
       </w:r>
     </w:p>
     <w:p>
@@ -2132,7 +2107,7 @@
           <wp:inline distT="0" distB="0" distL="0" distR="0">
             <wp:extent cx="5619750" cy="3514725"/>
             <wp:effectExtent t="0" r="0" b="0" l="0"/>
-            <wp:docPr id="1" name="08-statystyki.png" descr="08-statystyki.png" title="08-statystyki.png"/>
+            <wp:docPr id="1" name="07-wizyty-lekarza.png" descr="07-wizyty-lekarza.png" title="07-wizyty-lekarza.png"/>
             <wp:cNvGraphicFramePr>
               <a:graphicFrameLocks xmlns:a="http://schemas.openxmlformats.org/drawingml/2006/main" noChangeAspect="1"/>
             </wp:cNvGraphicFramePr>
@@ -2182,7 +2157,15 @@
           <w:sz w:val="20"/>
           <w:szCs w:val="20"/>
         </w:rPr>
-        <w:t xml:space="preserve">Rys. 8. Statystyki przychodni – liczby pacjentów, lekarzy i wizyt oraz wykres wizyt według specjalizacji.</w:t>
+        <w:t xml:space="preserve">Rys. 7. Historia wszystkich wizyt lekarza wraz ze statusami i zapisanymi zaleceniami.</w:t>
+      </w:r>
+    </w:p>
+    <w:p>
+      <w:pPr>
+        <w:pStyle w:val="Heading2"/>
+      </w:pPr>
+      <w:r>
+        <w:t xml:space="preserve">6.4. Panel administratora</w:t>
       </w:r>
     </w:p>
     <w:p>
@@ -2195,7 +2178,7 @@
           <wp:inline distT="0" distB="0" distL="0" distR="0">
             <wp:extent cx="5619750" cy="3514725"/>
             <wp:effectExtent t="0" r="0" b="0" l="0"/>
-            <wp:docPr id="1" name="09-lekarze.png" descr="09-lekarze.png" title="09-lekarze.png"/>
+            <wp:docPr id="1" name="08-statystyki.png" descr="08-statystyki.png" title="08-statystyki.png"/>
             <wp:cNvGraphicFramePr>
               <a:graphicFrameLocks xmlns:a="http://schemas.openxmlformats.org/drawingml/2006/main" noChangeAspect="1"/>
             </wp:cNvGraphicFramePr>
@@ -2245,7 +2228,7 @@
           <w:sz w:val="20"/>
           <w:szCs w:val="20"/>
         </w:rPr>
-        <w:t xml:space="preserve">Rys. 9. Zarządzanie lekarzami – lista z możliwością dodawania, edycji i usuwania.</w:t>
+        <w:t xml:space="preserve">Rys. 8. Statystyki przychodni – liczby pacjentów, lekarzy i wizyt oraz wykres wizyt według specjalizacji.</w:t>
       </w:r>
     </w:p>
     <w:p>
@@ -2258,7 +2241,7 @@
           <wp:inline distT="0" distB="0" distL="0" distR="0">
             <wp:extent cx="5619750" cy="3514725"/>
             <wp:effectExtent t="0" r="0" b="0" l="0"/>
-            <wp:docPr id="1" name="10-nowy-lekarz.png" descr="10-nowy-lekarz.png" title="10-nowy-lekarz.png"/>
+            <wp:docPr id="1" name="09-lekarze.png" descr="09-lekarze.png" title="09-lekarze.png"/>
             <wp:cNvGraphicFramePr>
               <a:graphicFrameLocks xmlns:a="http://schemas.openxmlformats.org/drawingml/2006/main" noChangeAspect="1"/>
             </wp:cNvGraphicFramePr>
@@ -2308,7 +2291,7 @@
           <w:sz w:val="20"/>
           <w:szCs w:val="20"/>
         </w:rPr>
-        <w:t xml:space="preserve">Rys. 10. Dodawanie lekarza – tworzone jest konto z rolą DOCTOR wraz z grafikiem przyjęć i gabinetem.</w:t>
+        <w:t xml:space="preserve">Rys. 9. Zarządzanie lekarzami – lista z możliwością dodawania, edycji i usuwania.</w:t>
       </w:r>
     </w:p>
     <w:p>
@@ -2321,7 +2304,7 @@
           <wp:inline distT="0" distB="0" distL="0" distR="0">
             <wp:extent cx="5619750" cy="3514725"/>
             <wp:effectExtent t="0" r="0" b="0" l="0"/>
-            <wp:docPr id="1" name="11-specjalizacje.png" descr="11-specjalizacje.png" title="11-specjalizacje.png"/>
+            <wp:docPr id="1" name="10-nowy-lekarz.png" descr="10-nowy-lekarz.png" title="10-nowy-lekarz.png"/>
             <wp:cNvGraphicFramePr>
               <a:graphicFrameLocks xmlns:a="http://schemas.openxmlformats.org/drawingml/2006/main" noChangeAspect="1"/>
             </wp:cNvGraphicFramePr>
@@ -2371,7 +2354,7 @@
           <w:sz w:val="20"/>
           <w:szCs w:val="20"/>
         </w:rPr>
-        <w:t xml:space="preserve">Rys. 11. Zarządzanie specjalizacjami – dodawanie, zmiana nazwy i usuwanie (z ochroną specjalizacji przypisanych do lekarzy).</w:t>
+        <w:t xml:space="preserve">Rys. 10. Dodawanie lekarza – tworzone jest konto z rolą DOCTOR wraz z grafikiem przyjęć i gabinetem.</w:t>
       </w:r>
     </w:p>
     <w:p>
@@ -2384,7 +2367,7 @@
           <wp:inline distT="0" distB="0" distL="0" distR="0">
             <wp:extent cx="5619750" cy="3514725"/>
             <wp:effectExtent t="0" r="0" b="0" l="0"/>
-            <wp:docPr id="1" name="12-uzytkownicy.png" descr="12-uzytkownicy.png" title="12-uzytkownicy.png"/>
+            <wp:docPr id="1" name="11-specjalizacje.png" descr="11-specjalizacje.png" title="11-specjalizacje.png"/>
             <wp:cNvGraphicFramePr>
               <a:graphicFrameLocks xmlns:a="http://schemas.openxmlformats.org/drawingml/2006/main" noChangeAspect="1"/>
             </wp:cNvGraphicFramePr>
@@ -2434,7 +2417,7 @@
           <w:sz w:val="20"/>
           <w:szCs w:val="20"/>
         </w:rPr>
-        <w:t xml:space="preserve">Rys. 12. Zarządzanie użytkownikami – przegląd wszystkich kont z rolami i możliwością usunięcia.</w:t>
+        <w:t xml:space="preserve">Rys. 11. Zarządzanie specjalizacjami – dodawanie, zmiana nazwy i usuwanie (z ochroną specjalizacji przypisanych do lekarzy).</w:t>
       </w:r>
     </w:p>
     <w:p>
@@ -2447,7 +2430,7 @@
           <wp:inline distT="0" distB="0" distL="0" distR="0">
             <wp:extent cx="5619750" cy="3514725"/>
             <wp:effectExtent t="0" r="0" b="0" l="0"/>
-            <wp:docPr id="1" name="13-wizyty-admin.png" descr="13-wizyty-admin.png" title="13-wizyty-admin.png"/>
+            <wp:docPr id="1" name="12-uzytkownicy.png" descr="12-uzytkownicy.png" title="12-uzytkownicy.png"/>
             <wp:cNvGraphicFramePr>
               <a:graphicFrameLocks xmlns:a="http://schemas.openxmlformats.org/drawingml/2006/main" noChangeAspect="1"/>
             </wp:cNvGraphicFramePr>
@@ -2497,6 +2480,69 @@
           <w:sz w:val="20"/>
           <w:szCs w:val="20"/>
         </w:rPr>
+        <w:t xml:space="preserve">Rys. 12. Zarządzanie użytkownikami – przegląd wszystkich kont z rolami i możliwością usunięcia.</w:t>
+      </w:r>
+    </w:p>
+    <w:p>
+      <w:pPr>
+        <w:spacing w:after="60" w:before="120"/>
+        <w:jc w:val="center"/>
+      </w:pPr>
+      <w:r>
+        <w:drawing>
+          <wp:inline distT="0" distB="0" distL="0" distR="0">
+            <wp:extent cx="5619750" cy="3514725"/>
+            <wp:effectExtent t="0" r="0" b="0" l="0"/>
+            <wp:docPr id="1" name="13-wizyty-admin.png" descr="13-wizyty-admin.png" title="13-wizyty-admin.png"/>
+            <wp:cNvGraphicFramePr>
+              <a:graphicFrameLocks xmlns:a="http://schemas.openxmlformats.org/drawingml/2006/main" noChangeAspect="1"/>
+            </wp:cNvGraphicFramePr>
+            <a:graphic xmlns:a="http://schemas.openxmlformats.org/drawingml/2006/main">
+              <a:graphicData uri="http://schemas.openxmlformats.org/drawingml/2006/picture">
+                <pic:pic xmlns:pic="http://schemas.openxmlformats.org/drawingml/2006/picture">
+                  <pic:nvPicPr>
+                    <pic:cNvPr id="0" name="" descr=""/>
+                    <pic:cNvPicPr>
+                      <a:picLocks noChangeAspect="1" noChangeArrowheads="1"/>
+                    </pic:cNvPicPr>
+                  </pic:nvPicPr>
+                  <pic:blipFill>
+                    <a:blip r:embed="rId21" cstate="none"/>
+                    <a:srcRect/>
+                    <a:stretch>
+                      <a:fillRect/>
+                    </a:stretch>
+                  </pic:blipFill>
+                  <pic:spPr bwMode="auto">
+                    <a:xfrm>
+                      <a:off x="0" y="0"/>
+                      <a:ext cx="5619750" cy="3514725"/>
+                    </a:xfrm>
+                    <a:prstGeom prst="rect">
+                      <a:avLst/>
+                    </a:prstGeom>
+                  </pic:spPr>
+                </pic:pic>
+              </a:graphicData>
+            </a:graphic>
+          </wp:inline>
+        </w:drawing>
+      </w:r>
+    </w:p>
+    <w:p>
+      <w:pPr>
+        <w:spacing w:after="240"/>
+        <w:jc w:val="center"/>
+      </w:pPr>
+      <w:r>
+        <w:rPr>
+          <w:rFonts w:ascii="Arial" w:cs="Arial" w:eastAsia="Arial" w:hAnsi="Arial"/>
+          <w:i/>
+          <w:iCs/>
+          <w:color w:val="444444"/>
+          <w:sz w:val="20"/>
+          <w:szCs w:val="20"/>
+        </w:rPr>
         <w:t xml:space="preserve">Rys. 13. Przegląd wszystkich wizyt w systemie z filtrem po statusie.</w:t>
       </w:r>
     </w:p>
@@ -2532,7 +2578,7 @@
                     </pic:cNvPicPr>
                   </pic:nvPicPr>
                   <pic:blipFill>
-                    <a:blip r:embed="rId21" cstate="none"/>
+                    <a:blip r:embed="rId22" cstate="none"/>
                     <a:srcRect/>
                     <a:stretch>
                       <a:fillRect/>

</xml_diff>